<commit_message>
fix(termo): use 2-column borderless table for dual lawyer signatures
</commit_message>
<xml_diff>
--- a/templates/14_termo_representacao_inss.docx
+++ b/templates/14_termo_representacao_inss.docx
@@ -442,48 +442,169 @@
         <w:t xml:space="preserve">{#tem_duas_advogadas}</w:t>
       </w:r>
     </w:p>
-    <w:p>
-      <w:pPr>
-        <w:spacing w:after="0" w:before="80" w:line="276" w:lineRule="auto"/>
-        <w:jc w:val="left"/>
-      </w:pPr>
-      <w:r>
-        <w:rPr>
-          <w:rFonts w:ascii="Arial" w:cs="Arial" w:eastAsia="Arial" w:hAnsi="Arial"/>
-          <w:sz w:val="22"/>
-          <w:szCs w:val="22"/>
-        </w:rPr>
-        <w:t xml:space="preserve">_________________________          _________________________</w:t>
-      </w:r>
-    </w:p>
-    <w:p>
-      <w:pPr>
-        <w:spacing w:after="0" w:before="0" w:line="276" w:lineRule="auto"/>
-        <w:jc w:val="left"/>
-      </w:pPr>
-      <w:r>
-        <w:rPr>
-          <w:rFonts w:ascii="Arial" w:cs="Arial" w:eastAsia="Arial" w:hAnsi="Arial"/>
-          <w:sz w:val="22"/>
-          <w:szCs w:val="22"/>
-        </w:rPr>
-        <w:t xml:space="preserve">{escritorio.adv1_nome}          {escritorio.adv2_nome}</w:t>
-      </w:r>
-    </w:p>
-    <w:p>
-      <w:pPr>
-        <w:spacing w:after="0" w:before="0" w:line="276" w:lineRule="auto"/>
-        <w:jc w:val="left"/>
-      </w:pPr>
-      <w:r>
-        <w:rPr>
-          <w:rFonts w:ascii="Arial" w:cs="Arial" w:eastAsia="Arial" w:hAnsi="Arial"/>
-          <w:sz w:val="22"/>
-          <w:szCs w:val="22"/>
-        </w:rPr>
-        <w:t xml:space="preserve">OAB {escritorio.adv1_oab}          OAB {escritorio.adv2_oab}</w:t>
-      </w:r>
-    </w:p>
+    <w:tbl>
+      <w:tblPr>
+        <w:tblW w:type="pct" w:w="100%"/>
+        <w:tblBorders>
+          <w:top w:val="none" w:color="FFFFFF" w:sz="0"/>
+          <w:left w:val="none" w:color="FFFFFF" w:sz="0"/>
+          <w:bottom w:val="none" w:color="FFFFFF" w:sz="0"/>
+          <w:right w:val="none" w:color="FFFFFF" w:sz="0"/>
+          <w:insideH w:val="single" w:color="auto" w:sz="4"/>
+          <w:insideV w:val="single" w:color="auto" w:sz="4"/>
+        </w:tblBorders>
+      </w:tblPr>
+      <w:tblGrid>
+        <w:gridCol w:w="100"/>
+        <w:gridCol w:w="100"/>
+      </w:tblGrid>
+      <w:tr>
+        <w:tc>
+          <w:tcPr>
+            <w:tcW w:type="pct" w:w="50%"/>
+            <w:tcBorders>
+              <w:top w:val="none" w:color="FFFFFF" w:sz="0"/>
+              <w:left w:val="none" w:color="FFFFFF" w:sz="0"/>
+              <w:bottom w:val="none" w:color="FFFFFF" w:sz="0"/>
+              <w:right w:val="none" w:color="FFFFFF" w:sz="0"/>
+            </w:tcBorders>
+          </w:tcPr>
+          <w:p>
+            <w:pPr>
+              <w:spacing w:after="0" w:before="80" w:line="276" w:lineRule="auto"/>
+            </w:pPr>
+            <w:r>
+              <w:rPr>
+                <w:rFonts w:ascii="Arial" w:cs="Arial" w:eastAsia="Arial" w:hAnsi="Arial"/>
+                <w:sz w:val="22"/>
+                <w:szCs w:val="22"/>
+              </w:rPr>
+              <w:t xml:space="preserve">_________________________</w:t>
+            </w:r>
+          </w:p>
+        </w:tc>
+        <w:tc>
+          <w:tcPr>
+            <w:tcW w:type="pct" w:w="50%"/>
+            <w:tcBorders>
+              <w:top w:val="none" w:color="FFFFFF" w:sz="0"/>
+              <w:left w:val="none" w:color="FFFFFF" w:sz="0"/>
+              <w:bottom w:val="none" w:color="FFFFFF" w:sz="0"/>
+              <w:right w:val="none" w:color="FFFFFF" w:sz="0"/>
+            </w:tcBorders>
+          </w:tcPr>
+          <w:p>
+            <w:pPr>
+              <w:spacing w:after="0" w:before="80" w:line="276" w:lineRule="auto"/>
+            </w:pPr>
+            <w:r>
+              <w:rPr>
+                <w:rFonts w:ascii="Arial" w:cs="Arial" w:eastAsia="Arial" w:hAnsi="Arial"/>
+                <w:sz w:val="22"/>
+                <w:szCs w:val="22"/>
+              </w:rPr>
+              <w:t xml:space="preserve">_________________________</w:t>
+            </w:r>
+          </w:p>
+        </w:tc>
+      </w:tr>
+      <w:tr>
+        <w:tc>
+          <w:tcPr>
+            <w:tcBorders>
+              <w:top w:val="none" w:color="FFFFFF" w:sz="0"/>
+              <w:left w:val="none" w:color="FFFFFF" w:sz="0"/>
+              <w:bottom w:val="none" w:color="FFFFFF" w:sz="0"/>
+              <w:right w:val="none" w:color="FFFFFF" w:sz="0"/>
+            </w:tcBorders>
+          </w:tcPr>
+          <w:p>
+            <w:pPr>
+              <w:spacing w:after="0" w:before="0" w:line="276" w:lineRule="auto"/>
+            </w:pPr>
+            <w:r>
+              <w:rPr>
+                <w:rFonts w:ascii="Arial" w:cs="Arial" w:eastAsia="Arial" w:hAnsi="Arial"/>
+                <w:sz w:val="22"/>
+                <w:szCs w:val="22"/>
+              </w:rPr>
+              <w:t xml:space="preserve">{escritorio.adv1_nome}</w:t>
+            </w:r>
+          </w:p>
+        </w:tc>
+        <w:tc>
+          <w:tcPr>
+            <w:tcBorders>
+              <w:top w:val="none" w:color="FFFFFF" w:sz="0"/>
+              <w:left w:val="none" w:color="FFFFFF" w:sz="0"/>
+              <w:bottom w:val="none" w:color="FFFFFF" w:sz="0"/>
+              <w:right w:val="none" w:color="FFFFFF" w:sz="0"/>
+            </w:tcBorders>
+          </w:tcPr>
+          <w:p>
+            <w:pPr>
+              <w:spacing w:after="0" w:before="0" w:line="276" w:lineRule="auto"/>
+            </w:pPr>
+            <w:r>
+              <w:rPr>
+                <w:rFonts w:ascii="Arial" w:cs="Arial" w:eastAsia="Arial" w:hAnsi="Arial"/>
+                <w:sz w:val="22"/>
+                <w:szCs w:val="22"/>
+              </w:rPr>
+              <w:t xml:space="preserve">{escritorio.adv2_nome}</w:t>
+            </w:r>
+          </w:p>
+        </w:tc>
+      </w:tr>
+      <w:tr>
+        <w:tc>
+          <w:tcPr>
+            <w:tcBorders>
+              <w:top w:val="none" w:color="FFFFFF" w:sz="0"/>
+              <w:left w:val="none" w:color="FFFFFF" w:sz="0"/>
+              <w:bottom w:val="none" w:color="FFFFFF" w:sz="0"/>
+              <w:right w:val="none" w:color="FFFFFF" w:sz="0"/>
+            </w:tcBorders>
+          </w:tcPr>
+          <w:p>
+            <w:pPr>
+              <w:spacing w:after="80" w:before="0" w:line="276" w:lineRule="auto"/>
+            </w:pPr>
+            <w:r>
+              <w:rPr>
+                <w:rFonts w:ascii="Arial" w:cs="Arial" w:eastAsia="Arial" w:hAnsi="Arial"/>
+                <w:sz w:val="22"/>
+                <w:szCs w:val="22"/>
+              </w:rPr>
+              <w:t xml:space="preserve">OAB {escritorio.adv1_oab}</w:t>
+            </w:r>
+          </w:p>
+        </w:tc>
+        <w:tc>
+          <w:tcPr>
+            <w:tcBorders>
+              <w:top w:val="none" w:color="FFFFFF" w:sz="0"/>
+              <w:left w:val="none" w:color="FFFFFF" w:sz="0"/>
+              <w:bottom w:val="none" w:color="FFFFFF" w:sz="0"/>
+              <w:right w:val="none" w:color="FFFFFF" w:sz="0"/>
+            </w:tcBorders>
+          </w:tcPr>
+          <w:p>
+            <w:pPr>
+              <w:spacing w:after="80" w:before="0" w:line="276" w:lineRule="auto"/>
+            </w:pPr>
+            <w:r>
+              <w:rPr>
+                <w:rFonts w:ascii="Arial" w:cs="Arial" w:eastAsia="Arial" w:hAnsi="Arial"/>
+                <w:sz w:val="22"/>
+                <w:szCs w:val="22"/>
+              </w:rPr>
+              <w:t xml:space="preserve">OAB {escritorio.adv2_oab}</w:t>
+            </w:r>
+          </w:p>
+        </w:tc>
+      </w:tr>
+    </w:tbl>
     <w:p>
       <w:pPr>
         <w:spacing w:after="0" w:before="0" w:line="276" w:lineRule="auto"/>

</xml_diff>

<commit_message>
fix: padronizar espaçamento nas linhas de assinatura do Termo de Representação
SP → SP*3 (12pt) antes de cada linha de assinatura (segurado e advogadas).
CÓDIGO PENAL: before SP*2 → SP para compensar espaço adicionado.

Co-Authored-By: Claude Sonnet 4.6 <noreply@anthropic.com>
</commit_message>
<xml_diff>
--- a/templates/14_termo_representacao_inss.docx
+++ b/templates/14_termo_representacao_inss.docx
@@ -358,7 +358,7 @@
     </w:p>
     <w:p>
       <w:pPr>
-        <w:spacing w:after="0" w:before="80" w:line="276" w:lineRule="auto"/>
+        <w:spacing w:after="0" w:before="240" w:line="276" w:lineRule="auto"/>
         <w:jc w:val="left"/>
       </w:pPr>
       <w:r>
@@ -471,7 +471,7 @@
           </w:tcPr>
           <w:p>
             <w:pPr>
-              <w:spacing w:after="0" w:before="80" w:line="276" w:lineRule="auto"/>
+              <w:spacing w:after="0" w:before="240" w:line="276" w:lineRule="auto"/>
             </w:pPr>
             <w:r>
               <w:rPr>
@@ -495,7 +495,7 @@
           </w:tcPr>
           <w:p>
             <w:pPr>
-              <w:spacing w:after="0" w:before="80" w:line="276" w:lineRule="auto"/>
+              <w:spacing w:after="0" w:before="240" w:line="276" w:lineRule="auto"/>
             </w:pPr>
             <w:r>
               <w:rPr>
@@ -649,7 +649,7 @@
     </w:p>
     <w:p>
       <w:pPr>
-        <w:spacing w:after="0" w:before="80" w:line="276" w:lineRule="auto"/>
+        <w:spacing w:after="0" w:before="240" w:line="276" w:lineRule="auto"/>
         <w:jc w:val="left"/>
       </w:pPr>
       <w:r>
@@ -719,7 +719,7 @@
     </w:p>
     <w:p>
       <w:pPr>
-        <w:spacing w:after="0" w:before="80" w:line="276" w:lineRule="auto"/>
+        <w:spacing w:after="0" w:before="240" w:line="276" w:lineRule="auto"/>
         <w:jc w:val="left"/>
       </w:pPr>
       <w:r>
@@ -789,7 +789,7 @@
     </w:p>
     <w:p>
       <w:pPr>
-        <w:spacing w:after="80" w:before="160" w:line="276" w:lineRule="auto"/>
+        <w:spacing w:after="80" w:before="80" w:line="276" w:lineRule="auto"/>
         <w:jc w:val="left"/>
       </w:pPr>
       <w:r>

</xml_diff>

<commit_message>
fix: refinar espaçamento nas seções de assinatura do Termo de Representação
- pAssin aceita spAfter opcional para controle fino pós-OAB
- TERMO DE RESPONSABILIDADE: after SP → SP*2 (8pt após título)
- Tabela advogadas: after SP → SP*2 nas células OAB (8pt antes do CP)
- Blocos advogada única: OAB with SP*2 after para paridade visual

Co-Authored-By: Claude Sonnet 4.6 <noreply@anthropic.com>
</commit_message>
<xml_diff>
--- a/templates/14_termo_representacao_inss.docx
+++ b/templates/14_termo_representacao_inss.docx
@@ -386,7 +386,7 @@
     </w:p>
     <w:p>
       <w:pPr>
-        <w:spacing w:after="80" w:before="160" w:line="276" w:lineRule="auto"/>
+        <w:spacing w:after="160" w:before="160" w:line="276" w:lineRule="auto"/>
         <w:jc w:val="left"/>
       </w:pPr>
       <w:r>
@@ -568,7 +568,7 @@
           </w:tcPr>
           <w:p>
             <w:pPr>
-              <w:spacing w:after="80" w:before="0" w:line="276" w:lineRule="auto"/>
+              <w:spacing w:after="160" w:before="0" w:line="276" w:lineRule="auto"/>
             </w:pPr>
             <w:r>
               <w:rPr>
@@ -591,7 +591,7 @@
           </w:tcPr>
           <w:p>
             <w:pPr>
-              <w:spacing w:after="80" w:before="0" w:line="276" w:lineRule="auto"/>
+              <w:spacing w:after="160" w:before="0" w:line="276" w:lineRule="auto"/>
             </w:pPr>
             <w:r>
               <w:rPr>
@@ -677,7 +677,7 @@
     </w:p>
     <w:p>
       <w:pPr>
-        <w:spacing w:after="0" w:before="0" w:line="276" w:lineRule="auto"/>
+        <w:spacing w:after="160" w:before="0" w:line="276" w:lineRule="auto"/>
         <w:jc w:val="left"/>
       </w:pPr>
       <w:r>
@@ -747,7 +747,7 @@
     </w:p>
     <w:p>
       <w:pPr>
-        <w:spacing w:after="0" w:before="0" w:line="276" w:lineRule="auto"/>
+        <w:spacing w:after="160" w:before="0" w:line="276" w:lineRule="auto"/>
         <w:jc w:val="left"/>
       </w:pPr>
       <w:r>

</xml_diff>

<commit_message>
feat: assinatura digital da Dra. Lidiane no Termo de Representação INSS
- Instala docxtemplater-image-module-free para embutir imagens nos DOCX
- Adiciona templates/assinaturas/lidiane.png (600px, fundo transparente)
- Atualiza docx-renderer.ts para usar ImageModule (makeImageModule()
  cria instância nova por render, requisito do módulo)
- Adiciona adv1_assinatura_path e incluir_assinatura_lidiane ao tipo
  TemplateContext e à função buildTemplateContext
- Propaga flag incluir_assinatura_lidiane por package-builder → route.ts
- Atualiza template 14_termo_representacao_inss.docx com blocos
  {#incluir_assinatura_lidiane}{%...}{/} para exibição condicional
- Adiciona checkbox "Incluir assinatura digital" no modal de advogada
  (visível apenas quando Lidiane está selecionada, default: marcado)
- next.config.ts: adiciona serverExternalPackages para o image module

Co-Authored-By: Claude Sonnet 4.6 <noreply@anthropic.com>
</commit_message>
<xml_diff>
--- a/templates/14_termo_representacao_inss.docx
+++ b/templates/14_termo_representacao_inss.docx
@@ -475,7 +475,77 @@
                 <w:sz w:val="22"/>
                 <w:szCs w:val="22"/>
               </w:rPr>
+              <w:t xml:space="preserve">{#incluir_assinatura_lidiane}</w:t>
+            </w:r>
+          </w:p>
+          <w:p>
+            <w:pPr>
+              <w:spacing w:after="0" w:before="0" w:line="276" w:lineRule="auto"/>
+              <w:jc w:val="left"/>
+            </w:pPr>
+            <w:r>
+              <w:rPr>
+                <w:rFonts w:ascii="Arial" w:cs="Arial" w:eastAsia="Arial" w:hAnsi="Arial"/>
+                <w:sz w:val="22"/>
+                <w:szCs w:val="22"/>
+              </w:rPr>
+              <w:t xml:space="preserve">{%escritorio.adv1_assinatura_path}</w:t>
+            </w:r>
+          </w:p>
+          <w:p>
+            <w:pPr>
+              <w:spacing w:after="0" w:before="0" w:line="276" w:lineRule="auto"/>
+              <w:jc w:val="left"/>
+            </w:pPr>
+            <w:r>
+              <w:rPr>
+                <w:rFonts w:ascii="Arial" w:cs="Arial" w:eastAsia="Arial" w:hAnsi="Arial"/>
+                <w:sz w:val="22"/>
+                <w:szCs w:val="22"/>
+              </w:rPr>
+              <w:t xml:space="preserve">{/incluir_assinatura_lidiane}</w:t>
+            </w:r>
+          </w:p>
+          <w:p>
+            <w:pPr>
+              <w:spacing w:after="0" w:before="0" w:line="276" w:lineRule="auto"/>
+              <w:jc w:val="left"/>
+            </w:pPr>
+            <w:r>
+              <w:rPr>
+                <w:rFonts w:ascii="Arial" w:cs="Arial" w:eastAsia="Arial" w:hAnsi="Arial"/>
+                <w:sz w:val="22"/>
+                <w:szCs w:val="22"/>
+              </w:rPr>
+              <w:t xml:space="preserve">{^incluir_assinatura_lidiane}</w:t>
+            </w:r>
+          </w:p>
+          <w:p>
+            <w:pPr>
+              <w:spacing w:after="0" w:before="0" w:line="276" w:lineRule="auto"/>
+              <w:jc w:val="left"/>
+            </w:pPr>
+            <w:r>
+              <w:rPr>
+                <w:rFonts w:ascii="Arial" w:cs="Arial" w:eastAsia="Arial" w:hAnsi="Arial"/>
+                <w:sz w:val="22"/>
+                <w:szCs w:val="22"/>
+              </w:rPr>
               <w:t xml:space="preserve">_________________________</w:t>
+            </w:r>
+          </w:p>
+          <w:p>
+            <w:pPr>
+              <w:spacing w:after="0" w:before="0" w:line="276" w:lineRule="auto"/>
+              <w:jc w:val="left"/>
+            </w:pPr>
+            <w:r>
+              <w:rPr>
+                <w:rFonts w:ascii="Arial" w:cs="Arial" w:eastAsia="Arial" w:hAnsi="Arial"/>
+                <w:sz w:val="22"/>
+                <w:szCs w:val="22"/>
+              </w:rPr>
+              <w:t xml:space="preserve">{/incluir_assinatura_lidiane}</w:t>
             </w:r>
           </w:p>
           <w:p>
@@ -600,6 +670,62 @@
     </w:p>
     <w:p>
       <w:pPr>
+        <w:spacing w:after="0" w:before="0" w:line="276" w:lineRule="auto"/>
+        <w:jc w:val="left"/>
+      </w:pPr>
+      <w:r>
+        <w:rPr>
+          <w:rFonts w:ascii="Arial" w:cs="Arial" w:eastAsia="Arial" w:hAnsi="Arial"/>
+          <w:sz w:val="22"/>
+          <w:szCs w:val="22"/>
+        </w:rPr>
+        <w:t xml:space="preserve">{#incluir_assinatura_lidiane}</w:t>
+      </w:r>
+    </w:p>
+    <w:p>
+      <w:pPr>
+        <w:spacing w:after="0" w:before="0" w:line="276" w:lineRule="auto"/>
+        <w:jc w:val="left"/>
+      </w:pPr>
+      <w:r>
+        <w:rPr>
+          <w:rFonts w:ascii="Arial" w:cs="Arial" w:eastAsia="Arial" w:hAnsi="Arial"/>
+          <w:sz w:val="22"/>
+          <w:szCs w:val="22"/>
+        </w:rPr>
+        <w:t xml:space="preserve">{%escritorio.adv1_assinatura_path}</w:t>
+      </w:r>
+    </w:p>
+    <w:p>
+      <w:pPr>
+        <w:spacing w:after="0" w:before="0" w:line="276" w:lineRule="auto"/>
+        <w:jc w:val="left"/>
+      </w:pPr>
+      <w:r>
+        <w:rPr>
+          <w:rFonts w:ascii="Arial" w:cs="Arial" w:eastAsia="Arial" w:hAnsi="Arial"/>
+          <w:sz w:val="22"/>
+          <w:szCs w:val="22"/>
+        </w:rPr>
+        <w:t xml:space="preserve">{/incluir_assinatura_lidiane}</w:t>
+      </w:r>
+    </w:p>
+    <w:p>
+      <w:pPr>
+        <w:spacing w:after="0" w:before="0" w:line="276" w:lineRule="auto"/>
+        <w:jc w:val="left"/>
+      </w:pPr>
+      <w:r>
+        <w:rPr>
+          <w:rFonts w:ascii="Arial" w:cs="Arial" w:eastAsia="Arial" w:hAnsi="Arial"/>
+          <w:sz w:val="22"/>
+          <w:szCs w:val="22"/>
+        </w:rPr>
+        <w:t xml:space="preserve">{^incluir_assinatura_lidiane}</w:t>
+      </w:r>
+    </w:p>
+    <w:p>
+      <w:pPr>
         <w:spacing w:after="0" w:before="320" w:line="276" w:lineRule="auto"/>
         <w:jc w:val="left"/>
       </w:pPr>
@@ -610,6 +736,20 @@
           <w:szCs w:val="22"/>
         </w:rPr>
         <w:t xml:space="preserve">_________________________</w:t>
+      </w:r>
+    </w:p>
+    <w:p>
+      <w:pPr>
+        <w:spacing w:after="0" w:before="0" w:line="276" w:lineRule="auto"/>
+        <w:jc w:val="left"/>
+      </w:pPr>
+      <w:r>
+        <w:rPr>
+          <w:rFonts w:ascii="Arial" w:cs="Arial" w:eastAsia="Arial" w:hAnsi="Arial"/>
+          <w:sz w:val="22"/>
+          <w:szCs w:val="22"/>
+        </w:rPr>
+        <w:t xml:space="preserve">{/incluir_assinatura_lidiane}</w:t>
       </w:r>
     </w:p>
     <w:p>

</xml_diff>

<commit_message>
fix: checkboxes X negrito, busca sem reset de seleção, tutor_nato sempre marcado
- Templates 14 e 15 reconstruídos: ☑/☐ → (X)/(  ) com X em negrito
- template-context.ts: adiciona checkbox_X e checkbox_qualidade_representacao_X
  ao contexto; tutor_nato sempre marcado no Termo de Responsabilidade
- gerar-modo.tsx: remove setSelected([]) do onChange da busca — seleção não
  era mais zerada a cada tecla digitada, corrigindo o fluxo busca + modal
- Scripts de geração e testes atualizados para usar checkboxAndX()

Co-Authored-By: Claude Sonnet 4.6 <noreply@anthropic.com>
</commit_message>
<xml_diff>
--- a/templates/14_termo_representacao_inss.docx
+++ b/templates/14_termo_representacao_inss.docx
@@ -227,105 +227,649 @@
           <w:sz w:val="22"/>
           <w:szCs w:val="22"/>
         </w:rPr>
-        <w:t xml:space="preserve">I.    {checkbox.aposentadoria_idade} Aposentadoria por Idade   {checkbox.aposentadoria_idade_urbana} urbana   {checkbox.aposentadoria_idade_rural} rural</w:t>
-      </w:r>
-    </w:p>
-    <w:p>
-      <w:pPr>
-        <w:spacing w:after="0" w:before="0" w:line="276" w:lineRule="auto"/>
-        <w:jc w:val="left"/>
-      </w:pPr>
-      <w:r>
-        <w:rPr>
-          <w:rFonts w:ascii="Arial" w:cs="Arial" w:eastAsia="Arial" w:hAnsi="Arial"/>
-          <w:sz w:val="22"/>
-          <w:szCs w:val="22"/>
-        </w:rPr>
-        <w:t xml:space="preserve">II.   {checkbox.aposentadoria_tempo} Aposentadoria por Tempo de Contribuição</w:t>
-      </w:r>
-    </w:p>
-    <w:p>
-      <w:pPr>
-        <w:spacing w:after="0" w:before="0" w:line="276" w:lineRule="auto"/>
-        <w:jc w:val="left"/>
-      </w:pPr>
-      <w:r>
-        <w:rPr>
-          <w:rFonts w:ascii="Arial" w:cs="Arial" w:eastAsia="Arial" w:hAnsi="Arial"/>
-          <w:sz w:val="22"/>
-          <w:szCs w:val="22"/>
-        </w:rPr>
-        <w:t xml:space="preserve">III.  {checkbox.aposentadoria_especial} Aposentadoria Especial</w:t>
-      </w:r>
-    </w:p>
-    <w:p>
-      <w:pPr>
-        <w:spacing w:after="0" w:before="0" w:line="276" w:lineRule="auto"/>
-        <w:jc w:val="left"/>
-      </w:pPr>
-      <w:r>
-        <w:rPr>
-          <w:rFonts w:ascii="Arial" w:cs="Arial" w:eastAsia="Arial" w:hAnsi="Arial"/>
-          <w:sz w:val="22"/>
-          <w:szCs w:val="22"/>
-        </w:rPr>
-        <w:t xml:space="preserve">IV.   {checkbox.pensao_morte} Pensão por Morte Previdenciária   {checkbox.pensao_morte_urbana} urbana   {checkbox.pensao_morte_rural} rural</w:t>
-      </w:r>
-    </w:p>
-    <w:p>
-      <w:pPr>
-        <w:spacing w:after="0" w:before="0" w:line="276" w:lineRule="auto"/>
-        <w:jc w:val="left"/>
-      </w:pPr>
-      <w:r>
-        <w:rPr>
-          <w:rFonts w:ascii="Arial" w:cs="Arial" w:eastAsia="Arial" w:hAnsi="Arial"/>
-          <w:sz w:val="22"/>
-          <w:szCs w:val="22"/>
-        </w:rPr>
-        <w:t xml:space="preserve">V.    {checkbox.auxilio_reclusao} Auxílio-Reclusão   {checkbox.auxilio_reclusao_urbano} urbano   {checkbox.auxilio_reclusao_rural} rural</w:t>
-      </w:r>
-    </w:p>
-    <w:p>
-      <w:pPr>
-        <w:spacing w:after="0" w:before="0" w:line="276" w:lineRule="auto"/>
-        <w:jc w:val="left"/>
-      </w:pPr>
-      <w:r>
-        <w:rPr>
-          <w:rFonts w:ascii="Arial" w:cs="Arial" w:eastAsia="Arial" w:hAnsi="Arial"/>
-          <w:sz w:val="22"/>
-          <w:szCs w:val="22"/>
-        </w:rPr>
-        <w:t xml:space="preserve">VI.   {checkbox.salario_maternidade} Salário-Maternidade   {checkbox.salario_maternidade_urbano} urbano   {checkbox.salario_maternidade_rural} rural</w:t>
-      </w:r>
-    </w:p>
-    <w:p>
-      <w:pPr>
-        <w:spacing w:after="0" w:before="0" w:line="276" w:lineRule="auto"/>
-        <w:jc w:val="left"/>
-      </w:pPr>
-      <w:r>
-        <w:rPr>
-          <w:rFonts w:ascii="Arial" w:cs="Arial" w:eastAsia="Arial" w:hAnsi="Arial"/>
-          <w:sz w:val="22"/>
-          <w:szCs w:val="22"/>
-        </w:rPr>
-        <w:t xml:space="preserve">VII.  {checkbox.bpc} Benefício de Prestação Continuada – BPC/LOAS</w:t>
-      </w:r>
-    </w:p>
-    <w:p>
-      <w:pPr>
-        <w:spacing w:after="0" w:before="0" w:line="276" w:lineRule="auto"/>
-        <w:jc w:val="left"/>
-      </w:pPr>
-      <w:r>
-        <w:rPr>
-          <w:rFonts w:ascii="Arial" w:cs="Arial" w:eastAsia="Arial" w:hAnsi="Arial"/>
-          <w:sz w:val="22"/>
-          <w:szCs w:val="22"/>
-        </w:rPr>
-        <w:t xml:space="preserve">VIII. {checkbox.atualizacao_cadastral} Atualização Cadastral</w:t>
+        <w:t xml:space="preserve">I.    </w:t>
+      </w:r>
+      <w:r>
+        <w:rPr>
+          <w:rFonts w:ascii="Arial" w:cs="Arial" w:eastAsia="Arial" w:hAnsi="Arial"/>
+          <w:sz w:val="22"/>
+          <w:szCs w:val="22"/>
+        </w:rPr>
+        <w:t xml:space="preserve">(</w:t>
+      </w:r>
+      <w:r>
+        <w:rPr>
+          <w:rFonts w:ascii="Arial" w:cs="Arial" w:eastAsia="Arial" w:hAnsi="Arial"/>
+          <w:b/>
+          <w:bCs/>
+          <w:sz w:val="22"/>
+          <w:szCs w:val="22"/>
+        </w:rPr>
+        <w:t xml:space="preserve">{checkbox_X.aposentadoria_idade}</w:t>
+      </w:r>
+      <w:r>
+        <w:rPr>
+          <w:rFonts w:ascii="Arial" w:cs="Arial" w:eastAsia="Arial" w:hAnsi="Arial"/>
+          <w:sz w:val="22"/>
+          <w:szCs w:val="22"/>
+        </w:rPr>
+        <w:t xml:space="preserve">)</w:t>
+      </w:r>
+      <w:r>
+        <w:rPr>
+          <w:rFonts w:ascii="Arial" w:cs="Arial" w:eastAsia="Arial" w:hAnsi="Arial"/>
+          <w:sz w:val="22"/>
+          <w:szCs w:val="22"/>
+        </w:rPr>
+        <w:t xml:space="preserve"> Aposentadoria por Idade   </w:t>
+      </w:r>
+      <w:r>
+        <w:rPr>
+          <w:rFonts w:ascii="Arial" w:cs="Arial" w:eastAsia="Arial" w:hAnsi="Arial"/>
+          <w:sz w:val="22"/>
+          <w:szCs w:val="22"/>
+        </w:rPr>
+        <w:t xml:space="preserve">(</w:t>
+      </w:r>
+      <w:r>
+        <w:rPr>
+          <w:rFonts w:ascii="Arial" w:cs="Arial" w:eastAsia="Arial" w:hAnsi="Arial"/>
+          <w:b/>
+          <w:bCs/>
+          <w:sz w:val="22"/>
+          <w:szCs w:val="22"/>
+        </w:rPr>
+        <w:t xml:space="preserve">{checkbox_X.aposentadoria_idade_urbana}</w:t>
+      </w:r>
+      <w:r>
+        <w:rPr>
+          <w:rFonts w:ascii="Arial" w:cs="Arial" w:eastAsia="Arial" w:hAnsi="Arial"/>
+          <w:sz w:val="22"/>
+          <w:szCs w:val="22"/>
+        </w:rPr>
+        <w:t xml:space="preserve">)</w:t>
+      </w:r>
+      <w:r>
+        <w:rPr>
+          <w:rFonts w:ascii="Arial" w:cs="Arial" w:eastAsia="Arial" w:hAnsi="Arial"/>
+          <w:sz w:val="22"/>
+          <w:szCs w:val="22"/>
+        </w:rPr>
+        <w:t xml:space="preserve"> urbana   </w:t>
+      </w:r>
+      <w:r>
+        <w:rPr>
+          <w:rFonts w:ascii="Arial" w:cs="Arial" w:eastAsia="Arial" w:hAnsi="Arial"/>
+          <w:sz w:val="22"/>
+          <w:szCs w:val="22"/>
+        </w:rPr>
+        <w:t xml:space="preserve">(</w:t>
+      </w:r>
+      <w:r>
+        <w:rPr>
+          <w:rFonts w:ascii="Arial" w:cs="Arial" w:eastAsia="Arial" w:hAnsi="Arial"/>
+          <w:b/>
+          <w:bCs/>
+          <w:sz w:val="22"/>
+          <w:szCs w:val="22"/>
+        </w:rPr>
+        <w:t xml:space="preserve">{checkbox_X.aposentadoria_idade_rural}</w:t>
+      </w:r>
+      <w:r>
+        <w:rPr>
+          <w:rFonts w:ascii="Arial" w:cs="Arial" w:eastAsia="Arial" w:hAnsi="Arial"/>
+          <w:sz w:val="22"/>
+          <w:szCs w:val="22"/>
+        </w:rPr>
+        <w:t xml:space="preserve">)</w:t>
+      </w:r>
+      <w:r>
+        <w:rPr>
+          <w:rFonts w:ascii="Arial" w:cs="Arial" w:eastAsia="Arial" w:hAnsi="Arial"/>
+          <w:sz w:val="22"/>
+          <w:szCs w:val="22"/>
+        </w:rPr>
+        <w:t xml:space="preserve"> rural</w:t>
+      </w:r>
+    </w:p>
+    <w:p>
+      <w:pPr>
+        <w:spacing w:after="0" w:before="0" w:line="276" w:lineRule="auto"/>
+        <w:jc w:val="left"/>
+      </w:pPr>
+      <w:r>
+        <w:rPr>
+          <w:rFonts w:ascii="Arial" w:cs="Arial" w:eastAsia="Arial" w:hAnsi="Arial"/>
+          <w:sz w:val="22"/>
+          <w:szCs w:val="22"/>
+        </w:rPr>
+        <w:t xml:space="preserve">II.   </w:t>
+      </w:r>
+      <w:r>
+        <w:rPr>
+          <w:rFonts w:ascii="Arial" w:cs="Arial" w:eastAsia="Arial" w:hAnsi="Arial"/>
+          <w:sz w:val="22"/>
+          <w:szCs w:val="22"/>
+        </w:rPr>
+        <w:t xml:space="preserve">(</w:t>
+      </w:r>
+      <w:r>
+        <w:rPr>
+          <w:rFonts w:ascii="Arial" w:cs="Arial" w:eastAsia="Arial" w:hAnsi="Arial"/>
+          <w:b/>
+          <w:bCs/>
+          <w:sz w:val="22"/>
+          <w:szCs w:val="22"/>
+        </w:rPr>
+        <w:t xml:space="preserve">{checkbox_X.aposentadoria_tempo}</w:t>
+      </w:r>
+      <w:r>
+        <w:rPr>
+          <w:rFonts w:ascii="Arial" w:cs="Arial" w:eastAsia="Arial" w:hAnsi="Arial"/>
+          <w:sz w:val="22"/>
+          <w:szCs w:val="22"/>
+        </w:rPr>
+        <w:t xml:space="preserve">)</w:t>
+      </w:r>
+      <w:r>
+        <w:rPr>
+          <w:rFonts w:ascii="Arial" w:cs="Arial" w:eastAsia="Arial" w:hAnsi="Arial"/>
+          <w:sz w:val="22"/>
+          <w:szCs w:val="22"/>
+        </w:rPr>
+        <w:t xml:space="preserve"> Aposentadoria por Tempo de Contribuição</w:t>
+      </w:r>
+    </w:p>
+    <w:p>
+      <w:pPr>
+        <w:spacing w:after="0" w:before="0" w:line="276" w:lineRule="auto"/>
+        <w:jc w:val="left"/>
+      </w:pPr>
+      <w:r>
+        <w:rPr>
+          <w:rFonts w:ascii="Arial" w:cs="Arial" w:eastAsia="Arial" w:hAnsi="Arial"/>
+          <w:sz w:val="22"/>
+          <w:szCs w:val="22"/>
+        </w:rPr>
+        <w:t xml:space="preserve">III.  </w:t>
+      </w:r>
+      <w:r>
+        <w:rPr>
+          <w:rFonts w:ascii="Arial" w:cs="Arial" w:eastAsia="Arial" w:hAnsi="Arial"/>
+          <w:sz w:val="22"/>
+          <w:szCs w:val="22"/>
+        </w:rPr>
+        <w:t xml:space="preserve">(</w:t>
+      </w:r>
+      <w:r>
+        <w:rPr>
+          <w:rFonts w:ascii="Arial" w:cs="Arial" w:eastAsia="Arial" w:hAnsi="Arial"/>
+          <w:b/>
+          <w:bCs/>
+          <w:sz w:val="22"/>
+          <w:szCs w:val="22"/>
+        </w:rPr>
+        <w:t xml:space="preserve">{checkbox_X.aposentadoria_especial}</w:t>
+      </w:r>
+      <w:r>
+        <w:rPr>
+          <w:rFonts w:ascii="Arial" w:cs="Arial" w:eastAsia="Arial" w:hAnsi="Arial"/>
+          <w:sz w:val="22"/>
+          <w:szCs w:val="22"/>
+        </w:rPr>
+        <w:t xml:space="preserve">)</w:t>
+      </w:r>
+      <w:r>
+        <w:rPr>
+          <w:rFonts w:ascii="Arial" w:cs="Arial" w:eastAsia="Arial" w:hAnsi="Arial"/>
+          <w:sz w:val="22"/>
+          <w:szCs w:val="22"/>
+        </w:rPr>
+        <w:t xml:space="preserve"> Aposentadoria Especial</w:t>
+      </w:r>
+    </w:p>
+    <w:p>
+      <w:pPr>
+        <w:spacing w:after="0" w:before="0" w:line="276" w:lineRule="auto"/>
+        <w:jc w:val="left"/>
+      </w:pPr>
+      <w:r>
+        <w:rPr>
+          <w:rFonts w:ascii="Arial" w:cs="Arial" w:eastAsia="Arial" w:hAnsi="Arial"/>
+          <w:sz w:val="22"/>
+          <w:szCs w:val="22"/>
+        </w:rPr>
+        <w:t xml:space="preserve">IV.   </w:t>
+      </w:r>
+      <w:r>
+        <w:rPr>
+          <w:rFonts w:ascii="Arial" w:cs="Arial" w:eastAsia="Arial" w:hAnsi="Arial"/>
+          <w:sz w:val="22"/>
+          <w:szCs w:val="22"/>
+        </w:rPr>
+        <w:t xml:space="preserve">(</w:t>
+      </w:r>
+      <w:r>
+        <w:rPr>
+          <w:rFonts w:ascii="Arial" w:cs="Arial" w:eastAsia="Arial" w:hAnsi="Arial"/>
+          <w:b/>
+          <w:bCs/>
+          <w:sz w:val="22"/>
+          <w:szCs w:val="22"/>
+        </w:rPr>
+        <w:t xml:space="preserve">{checkbox_X.pensao_morte}</w:t>
+      </w:r>
+      <w:r>
+        <w:rPr>
+          <w:rFonts w:ascii="Arial" w:cs="Arial" w:eastAsia="Arial" w:hAnsi="Arial"/>
+          <w:sz w:val="22"/>
+          <w:szCs w:val="22"/>
+        </w:rPr>
+        <w:t xml:space="preserve">)</w:t>
+      </w:r>
+      <w:r>
+        <w:rPr>
+          <w:rFonts w:ascii="Arial" w:cs="Arial" w:eastAsia="Arial" w:hAnsi="Arial"/>
+          <w:sz w:val="22"/>
+          <w:szCs w:val="22"/>
+        </w:rPr>
+        <w:t xml:space="preserve"> Pensão por Morte Previdenciária   </w:t>
+      </w:r>
+      <w:r>
+        <w:rPr>
+          <w:rFonts w:ascii="Arial" w:cs="Arial" w:eastAsia="Arial" w:hAnsi="Arial"/>
+          <w:sz w:val="22"/>
+          <w:szCs w:val="22"/>
+        </w:rPr>
+        <w:t xml:space="preserve">(</w:t>
+      </w:r>
+      <w:r>
+        <w:rPr>
+          <w:rFonts w:ascii="Arial" w:cs="Arial" w:eastAsia="Arial" w:hAnsi="Arial"/>
+          <w:b/>
+          <w:bCs/>
+          <w:sz w:val="22"/>
+          <w:szCs w:val="22"/>
+        </w:rPr>
+        <w:t xml:space="preserve">{checkbox_X.pensao_morte_urbana}</w:t>
+      </w:r>
+      <w:r>
+        <w:rPr>
+          <w:rFonts w:ascii="Arial" w:cs="Arial" w:eastAsia="Arial" w:hAnsi="Arial"/>
+          <w:sz w:val="22"/>
+          <w:szCs w:val="22"/>
+        </w:rPr>
+        <w:t xml:space="preserve">)</w:t>
+      </w:r>
+      <w:r>
+        <w:rPr>
+          <w:rFonts w:ascii="Arial" w:cs="Arial" w:eastAsia="Arial" w:hAnsi="Arial"/>
+          <w:sz w:val="22"/>
+          <w:szCs w:val="22"/>
+        </w:rPr>
+        <w:t xml:space="preserve"> urbana   </w:t>
+      </w:r>
+      <w:r>
+        <w:rPr>
+          <w:rFonts w:ascii="Arial" w:cs="Arial" w:eastAsia="Arial" w:hAnsi="Arial"/>
+          <w:sz w:val="22"/>
+          <w:szCs w:val="22"/>
+        </w:rPr>
+        <w:t xml:space="preserve">(</w:t>
+      </w:r>
+      <w:r>
+        <w:rPr>
+          <w:rFonts w:ascii="Arial" w:cs="Arial" w:eastAsia="Arial" w:hAnsi="Arial"/>
+          <w:b/>
+          <w:bCs/>
+          <w:sz w:val="22"/>
+          <w:szCs w:val="22"/>
+        </w:rPr>
+        <w:t xml:space="preserve">{checkbox_X.pensao_morte_rural}</w:t>
+      </w:r>
+      <w:r>
+        <w:rPr>
+          <w:rFonts w:ascii="Arial" w:cs="Arial" w:eastAsia="Arial" w:hAnsi="Arial"/>
+          <w:sz w:val="22"/>
+          <w:szCs w:val="22"/>
+        </w:rPr>
+        <w:t xml:space="preserve">)</w:t>
+      </w:r>
+      <w:r>
+        <w:rPr>
+          <w:rFonts w:ascii="Arial" w:cs="Arial" w:eastAsia="Arial" w:hAnsi="Arial"/>
+          <w:sz w:val="22"/>
+          <w:szCs w:val="22"/>
+        </w:rPr>
+        <w:t xml:space="preserve"> rural</w:t>
+      </w:r>
+    </w:p>
+    <w:p>
+      <w:pPr>
+        <w:spacing w:after="0" w:before="0" w:line="276" w:lineRule="auto"/>
+        <w:jc w:val="left"/>
+      </w:pPr>
+      <w:r>
+        <w:rPr>
+          <w:rFonts w:ascii="Arial" w:cs="Arial" w:eastAsia="Arial" w:hAnsi="Arial"/>
+          <w:sz w:val="22"/>
+          <w:szCs w:val="22"/>
+        </w:rPr>
+        <w:t xml:space="preserve">V.    </w:t>
+      </w:r>
+      <w:r>
+        <w:rPr>
+          <w:rFonts w:ascii="Arial" w:cs="Arial" w:eastAsia="Arial" w:hAnsi="Arial"/>
+          <w:sz w:val="22"/>
+          <w:szCs w:val="22"/>
+        </w:rPr>
+        <w:t xml:space="preserve">(</w:t>
+      </w:r>
+      <w:r>
+        <w:rPr>
+          <w:rFonts w:ascii="Arial" w:cs="Arial" w:eastAsia="Arial" w:hAnsi="Arial"/>
+          <w:b/>
+          <w:bCs/>
+          <w:sz w:val="22"/>
+          <w:szCs w:val="22"/>
+        </w:rPr>
+        <w:t xml:space="preserve">{checkbox_X.auxilio_reclusao}</w:t>
+      </w:r>
+      <w:r>
+        <w:rPr>
+          <w:rFonts w:ascii="Arial" w:cs="Arial" w:eastAsia="Arial" w:hAnsi="Arial"/>
+          <w:sz w:val="22"/>
+          <w:szCs w:val="22"/>
+        </w:rPr>
+        <w:t xml:space="preserve">)</w:t>
+      </w:r>
+      <w:r>
+        <w:rPr>
+          <w:rFonts w:ascii="Arial" w:cs="Arial" w:eastAsia="Arial" w:hAnsi="Arial"/>
+          <w:sz w:val="22"/>
+          <w:szCs w:val="22"/>
+        </w:rPr>
+        <w:t xml:space="preserve"> Auxílio-Reclusão   </w:t>
+      </w:r>
+      <w:r>
+        <w:rPr>
+          <w:rFonts w:ascii="Arial" w:cs="Arial" w:eastAsia="Arial" w:hAnsi="Arial"/>
+          <w:sz w:val="22"/>
+          <w:szCs w:val="22"/>
+        </w:rPr>
+        <w:t xml:space="preserve">(</w:t>
+      </w:r>
+      <w:r>
+        <w:rPr>
+          <w:rFonts w:ascii="Arial" w:cs="Arial" w:eastAsia="Arial" w:hAnsi="Arial"/>
+          <w:b/>
+          <w:bCs/>
+          <w:sz w:val="22"/>
+          <w:szCs w:val="22"/>
+        </w:rPr>
+        <w:t xml:space="preserve">{checkbox_X.auxilio_reclusao_urbano}</w:t>
+      </w:r>
+      <w:r>
+        <w:rPr>
+          <w:rFonts w:ascii="Arial" w:cs="Arial" w:eastAsia="Arial" w:hAnsi="Arial"/>
+          <w:sz w:val="22"/>
+          <w:szCs w:val="22"/>
+        </w:rPr>
+        <w:t xml:space="preserve">)</w:t>
+      </w:r>
+      <w:r>
+        <w:rPr>
+          <w:rFonts w:ascii="Arial" w:cs="Arial" w:eastAsia="Arial" w:hAnsi="Arial"/>
+          <w:sz w:val="22"/>
+          <w:szCs w:val="22"/>
+        </w:rPr>
+        <w:t xml:space="preserve"> urbano   </w:t>
+      </w:r>
+      <w:r>
+        <w:rPr>
+          <w:rFonts w:ascii="Arial" w:cs="Arial" w:eastAsia="Arial" w:hAnsi="Arial"/>
+          <w:sz w:val="22"/>
+          <w:szCs w:val="22"/>
+        </w:rPr>
+        <w:t xml:space="preserve">(</w:t>
+      </w:r>
+      <w:r>
+        <w:rPr>
+          <w:rFonts w:ascii="Arial" w:cs="Arial" w:eastAsia="Arial" w:hAnsi="Arial"/>
+          <w:b/>
+          <w:bCs/>
+          <w:sz w:val="22"/>
+          <w:szCs w:val="22"/>
+        </w:rPr>
+        <w:t xml:space="preserve">{checkbox_X.auxilio_reclusao_rural}</w:t>
+      </w:r>
+      <w:r>
+        <w:rPr>
+          <w:rFonts w:ascii="Arial" w:cs="Arial" w:eastAsia="Arial" w:hAnsi="Arial"/>
+          <w:sz w:val="22"/>
+          <w:szCs w:val="22"/>
+        </w:rPr>
+        <w:t xml:space="preserve">)</w:t>
+      </w:r>
+      <w:r>
+        <w:rPr>
+          <w:rFonts w:ascii="Arial" w:cs="Arial" w:eastAsia="Arial" w:hAnsi="Arial"/>
+          <w:sz w:val="22"/>
+          <w:szCs w:val="22"/>
+        </w:rPr>
+        <w:t xml:space="preserve"> rural</w:t>
+      </w:r>
+    </w:p>
+    <w:p>
+      <w:pPr>
+        <w:spacing w:after="0" w:before="0" w:line="276" w:lineRule="auto"/>
+        <w:jc w:val="left"/>
+      </w:pPr>
+      <w:r>
+        <w:rPr>
+          <w:rFonts w:ascii="Arial" w:cs="Arial" w:eastAsia="Arial" w:hAnsi="Arial"/>
+          <w:sz w:val="22"/>
+          <w:szCs w:val="22"/>
+        </w:rPr>
+        <w:t xml:space="preserve">VI.   </w:t>
+      </w:r>
+      <w:r>
+        <w:rPr>
+          <w:rFonts w:ascii="Arial" w:cs="Arial" w:eastAsia="Arial" w:hAnsi="Arial"/>
+          <w:sz w:val="22"/>
+          <w:szCs w:val="22"/>
+        </w:rPr>
+        <w:t xml:space="preserve">(</w:t>
+      </w:r>
+      <w:r>
+        <w:rPr>
+          <w:rFonts w:ascii="Arial" w:cs="Arial" w:eastAsia="Arial" w:hAnsi="Arial"/>
+          <w:b/>
+          <w:bCs/>
+          <w:sz w:val="22"/>
+          <w:szCs w:val="22"/>
+        </w:rPr>
+        <w:t xml:space="preserve">{checkbox_X.salario_maternidade}</w:t>
+      </w:r>
+      <w:r>
+        <w:rPr>
+          <w:rFonts w:ascii="Arial" w:cs="Arial" w:eastAsia="Arial" w:hAnsi="Arial"/>
+          <w:sz w:val="22"/>
+          <w:szCs w:val="22"/>
+        </w:rPr>
+        <w:t xml:space="preserve">)</w:t>
+      </w:r>
+      <w:r>
+        <w:rPr>
+          <w:rFonts w:ascii="Arial" w:cs="Arial" w:eastAsia="Arial" w:hAnsi="Arial"/>
+          <w:sz w:val="22"/>
+          <w:szCs w:val="22"/>
+        </w:rPr>
+        <w:t xml:space="preserve"> Salário-Maternidade   </w:t>
+      </w:r>
+      <w:r>
+        <w:rPr>
+          <w:rFonts w:ascii="Arial" w:cs="Arial" w:eastAsia="Arial" w:hAnsi="Arial"/>
+          <w:sz w:val="22"/>
+          <w:szCs w:val="22"/>
+        </w:rPr>
+        <w:t xml:space="preserve">(</w:t>
+      </w:r>
+      <w:r>
+        <w:rPr>
+          <w:rFonts w:ascii="Arial" w:cs="Arial" w:eastAsia="Arial" w:hAnsi="Arial"/>
+          <w:b/>
+          <w:bCs/>
+          <w:sz w:val="22"/>
+          <w:szCs w:val="22"/>
+        </w:rPr>
+        <w:t xml:space="preserve">{checkbox_X.salario_maternidade_urbano}</w:t>
+      </w:r>
+      <w:r>
+        <w:rPr>
+          <w:rFonts w:ascii="Arial" w:cs="Arial" w:eastAsia="Arial" w:hAnsi="Arial"/>
+          <w:sz w:val="22"/>
+          <w:szCs w:val="22"/>
+        </w:rPr>
+        <w:t xml:space="preserve">)</w:t>
+      </w:r>
+      <w:r>
+        <w:rPr>
+          <w:rFonts w:ascii="Arial" w:cs="Arial" w:eastAsia="Arial" w:hAnsi="Arial"/>
+          <w:sz w:val="22"/>
+          <w:szCs w:val="22"/>
+        </w:rPr>
+        <w:t xml:space="preserve"> urbano   </w:t>
+      </w:r>
+      <w:r>
+        <w:rPr>
+          <w:rFonts w:ascii="Arial" w:cs="Arial" w:eastAsia="Arial" w:hAnsi="Arial"/>
+          <w:sz w:val="22"/>
+          <w:szCs w:val="22"/>
+        </w:rPr>
+        <w:t xml:space="preserve">(</w:t>
+      </w:r>
+      <w:r>
+        <w:rPr>
+          <w:rFonts w:ascii="Arial" w:cs="Arial" w:eastAsia="Arial" w:hAnsi="Arial"/>
+          <w:b/>
+          <w:bCs/>
+          <w:sz w:val="22"/>
+          <w:szCs w:val="22"/>
+        </w:rPr>
+        <w:t xml:space="preserve">{checkbox_X.salario_maternidade_rural}</w:t>
+      </w:r>
+      <w:r>
+        <w:rPr>
+          <w:rFonts w:ascii="Arial" w:cs="Arial" w:eastAsia="Arial" w:hAnsi="Arial"/>
+          <w:sz w:val="22"/>
+          <w:szCs w:val="22"/>
+        </w:rPr>
+        <w:t xml:space="preserve">)</w:t>
+      </w:r>
+      <w:r>
+        <w:rPr>
+          <w:rFonts w:ascii="Arial" w:cs="Arial" w:eastAsia="Arial" w:hAnsi="Arial"/>
+          <w:sz w:val="22"/>
+          <w:szCs w:val="22"/>
+        </w:rPr>
+        <w:t xml:space="preserve"> rural</w:t>
+      </w:r>
+    </w:p>
+    <w:p>
+      <w:pPr>
+        <w:spacing w:after="0" w:before="0" w:line="276" w:lineRule="auto"/>
+        <w:jc w:val="left"/>
+      </w:pPr>
+      <w:r>
+        <w:rPr>
+          <w:rFonts w:ascii="Arial" w:cs="Arial" w:eastAsia="Arial" w:hAnsi="Arial"/>
+          <w:sz w:val="22"/>
+          <w:szCs w:val="22"/>
+        </w:rPr>
+        <w:t xml:space="preserve">VII.  </w:t>
+      </w:r>
+      <w:r>
+        <w:rPr>
+          <w:rFonts w:ascii="Arial" w:cs="Arial" w:eastAsia="Arial" w:hAnsi="Arial"/>
+          <w:sz w:val="22"/>
+          <w:szCs w:val="22"/>
+        </w:rPr>
+        <w:t xml:space="preserve">(</w:t>
+      </w:r>
+      <w:r>
+        <w:rPr>
+          <w:rFonts w:ascii="Arial" w:cs="Arial" w:eastAsia="Arial" w:hAnsi="Arial"/>
+          <w:b/>
+          <w:bCs/>
+          <w:sz w:val="22"/>
+          <w:szCs w:val="22"/>
+        </w:rPr>
+        <w:t xml:space="preserve">{checkbox_X.bpc}</w:t>
+      </w:r>
+      <w:r>
+        <w:rPr>
+          <w:rFonts w:ascii="Arial" w:cs="Arial" w:eastAsia="Arial" w:hAnsi="Arial"/>
+          <w:sz w:val="22"/>
+          <w:szCs w:val="22"/>
+        </w:rPr>
+        <w:t xml:space="preserve">)</w:t>
+      </w:r>
+      <w:r>
+        <w:rPr>
+          <w:rFonts w:ascii="Arial" w:cs="Arial" w:eastAsia="Arial" w:hAnsi="Arial"/>
+          <w:sz w:val="22"/>
+          <w:szCs w:val="22"/>
+        </w:rPr>
+        <w:t xml:space="preserve"> Benefício de Prestação Continuada – BPC/LOAS</w:t>
+      </w:r>
+    </w:p>
+    <w:p>
+      <w:pPr>
+        <w:spacing w:after="0" w:before="0" w:line="276" w:lineRule="auto"/>
+        <w:jc w:val="left"/>
+      </w:pPr>
+      <w:r>
+        <w:rPr>
+          <w:rFonts w:ascii="Arial" w:cs="Arial" w:eastAsia="Arial" w:hAnsi="Arial"/>
+          <w:sz w:val="22"/>
+          <w:szCs w:val="22"/>
+        </w:rPr>
+        <w:t xml:space="preserve">VIII. </w:t>
+      </w:r>
+      <w:r>
+        <w:rPr>
+          <w:rFonts w:ascii="Arial" w:cs="Arial" w:eastAsia="Arial" w:hAnsi="Arial"/>
+          <w:sz w:val="22"/>
+          <w:szCs w:val="22"/>
+        </w:rPr>
+        <w:t xml:space="preserve">(</w:t>
+      </w:r>
+      <w:r>
+        <w:rPr>
+          <w:rFonts w:ascii="Arial" w:cs="Arial" w:eastAsia="Arial" w:hAnsi="Arial"/>
+          <w:b/>
+          <w:bCs/>
+          <w:sz w:val="22"/>
+          <w:szCs w:val="22"/>
+        </w:rPr>
+        <w:t xml:space="preserve">{checkbox_X.atualizacao_cadastral}</w:t>
+      </w:r>
+      <w:r>
+        <w:rPr>
+          <w:rFonts w:ascii="Arial" w:cs="Arial" w:eastAsia="Arial" w:hAnsi="Arial"/>
+          <w:sz w:val="22"/>
+          <w:szCs w:val="22"/>
+        </w:rPr>
+        <w:t xml:space="preserve">)</w:t>
+      </w:r>
+      <w:r>
+        <w:rPr>
+          <w:rFonts w:ascii="Arial" w:cs="Arial" w:eastAsia="Arial" w:hAnsi="Arial"/>
+          <w:sz w:val="22"/>
+          <w:szCs w:val="22"/>
+        </w:rPr>
+        <w:t xml:space="preserve"> Atualização Cadastral</w:t>
       </w:r>
     </w:p>
     <w:p>

</xml_diff>